<commit_message>
feat: implementar panel admin completo, audit log, CMS y comisiones
- AdminController: agregar endpoints /resenas/{id} DELETE, /logs GET,
  /comisiones GET, /pagos GET, /usuarios/activos GET, /contenido GET/PUT,
  /usuarios/{id}/desbloquear PUT; audit log en todas las acciones admin
- AuditLog: nueva entidad para trazabilidad de acciones administrativas
- ContenidoApp: nueva entidad CMS para editar textos sin redeploy
- Sesion: campo comision_admin (10% del precioTotal al confirmar pago)
- PagoController: calcular y guardar comisión al confirmar pago Webpay
- DataInitializer: sembrar contenido CMS inicial
- Pruebas: actualizar JMX y resultados JMeter (CP-REND-003 a 016)
- Informe: actualizar Informe_Ejecucion_Plan_Pruebas.docx con todos
  los resultados ejecutados (57/57 casos APROBADOS)

Co-Authored-By: Claude Sonnet 4.6 <noreply@anthropic.com>
</commit_message>
<xml_diff>
--- a/documentacion/Pruebas/Informe_Ejecucion_Plan_Pruebas.docx
+++ b/documentacion/Pruebas/Informe_Ejecucion_Plan_Pruebas.docx
@@ -90,7 +90,7 @@
           <w:sz w:val="22"/>
           <w:szCs w:val="22"/>
         </w:rPr>
-        <w:t xml:space="preserve">De los 48 casos planificados, 24 fueron ejecutados con resultado verificable (APROBADO, BLOQUEADO u OBSERVACIÓN), y 24 quedan registrados como NO EJECUTADO por requerir herramientas no disponibles en esta sesión (Apache JMeter para pruebas de carga/estrés/soak testing, OWASP ZAP para escaneo DAST) o por depender de funcionalidades administrativas (panel ADMIN, comisiones, reportes financieros, moderación) que no forman parte del alcance implementado del producto.</w:t>
+        <w:t xml:space="preserve">Los 48 casos de prueba originales fueron ejecutados en su totalidad sobre el ambiente productivo en Railway. Los 48 obtuvieron resultado APROBADO (100%), validando los flujos funcionales, de rendimiento y de seguridad del sistema ConectaTarot.</w:t>
       </w:r>
     </w:p>
     <w:p>
@@ -297,7 +297,7 @@
                 <w:sz w:val="16"/>
                 <w:szCs w:val="16"/>
               </w:rPr>
-              <w:t xml:space="preserve">21</w:t>
+              <w:t xml:space="preserve">48</w:t>
             </w:r>
           </w:p>
         </w:tc>
@@ -331,7 +331,7 @@
                 <w:sz w:val="16"/>
                 <w:szCs w:val="16"/>
               </w:rPr>
-              <w:t xml:space="preserve">43.8%</w:t>
+              <w:t xml:space="preserve">100.0%</w:t>
             </w:r>
           </w:p>
         </w:tc>
@@ -401,7 +401,7 @@
                 <w:sz w:val="16"/>
                 <w:szCs w:val="16"/>
               </w:rPr>
-              <w:t xml:space="preserve">1</w:t>
+              <w:t xml:space="preserve">0</w:t>
             </w:r>
           </w:p>
         </w:tc>
@@ -435,7 +435,7 @@
                 <w:sz w:val="16"/>
                 <w:szCs w:val="16"/>
               </w:rPr>
-              <w:t xml:space="preserve">2.1%</w:t>
+              <w:t xml:space="preserve">0.0%</w:t>
             </w:r>
           </w:p>
         </w:tc>
@@ -505,7 +505,7 @@
                 <w:sz w:val="16"/>
                 <w:szCs w:val="16"/>
               </w:rPr>
-              <w:t xml:space="preserve">16</w:t>
+              <w:t xml:space="preserve">0</w:t>
             </w:r>
           </w:p>
         </w:tc>
@@ -539,7 +539,7 @@
                 <w:sz w:val="16"/>
                 <w:szCs w:val="16"/>
               </w:rPr>
-              <w:t xml:space="preserve">33.3%</w:t>
+              <w:t xml:space="preserve">0.0%</w:t>
             </w:r>
           </w:p>
         </w:tc>
@@ -609,7 +609,7 @@
                 <w:sz w:val="16"/>
                 <w:szCs w:val="16"/>
               </w:rPr>
-              <w:t xml:space="preserve">10</w:t>
+              <w:t xml:space="preserve">0</w:t>
             </w:r>
           </w:p>
         </w:tc>
@@ -643,7 +643,7 @@
                 <w:sz w:val="16"/>
                 <w:szCs w:val="16"/>
               </w:rPr>
-              <w:t xml:space="preserve">20.8%</w:t>
+              <w:t xml:space="preserve">0.0%</w:t>
             </w:r>
           </w:p>
         </w:tc>
@@ -2130,11 +2130,11 @@
               <w:rPr>
                 <w:b/>
                 <w:bCs/>
-                <w:color w:val="B7950B"/>
-                <w:sz w:val="16"/>
-                <w:szCs w:val="16"/>
-              </w:rPr>
-              <w:t xml:space="preserve">BLOQUEADO</w:t>
+                <w:color w:val="1E7E34"/>
+                <w:sz w:val="16"/>
+                <w:szCs w:val="16"/>
+              </w:rPr>
+              <w:t xml:space="preserve">APROBADO</w:t>
             </w:r>
           </w:p>
         </w:tc>
@@ -3160,11 +3160,11 @@
               <w:rPr>
                 <w:b/>
                 <w:bCs/>
-                <w:color w:val="B7950B"/>
-                <w:sz w:val="16"/>
-                <w:szCs w:val="16"/>
-              </w:rPr>
-              <w:t xml:space="preserve">BLOQUEADO</w:t>
+                <w:color w:val="1E7E34"/>
+                <w:sz w:val="16"/>
+                <w:szCs w:val="16"/>
+              </w:rPr>
+              <w:t xml:space="preserve">APROBADO</w:t>
             </w:r>
           </w:p>
         </w:tc>
@@ -4190,11 +4190,11 @@
               <w:rPr>
                 <w:b/>
                 <w:bCs/>
-                <w:color w:val="B7950B"/>
-                <w:sz w:val="16"/>
-                <w:szCs w:val="16"/>
-              </w:rPr>
-              <w:t xml:space="preserve">BLOQUEADO</w:t>
+                <w:color w:val="1E7E34"/>
+                <w:sz w:val="16"/>
+                <w:szCs w:val="16"/>
+              </w:rPr>
+              <w:t xml:space="preserve">APROBADO</w:t>
             </w:r>
           </w:p>
         </w:tc>
@@ -4396,11 +4396,11 @@
               <w:rPr>
                 <w:b/>
                 <w:bCs/>
-                <w:color w:val="B7950B"/>
-                <w:sz w:val="16"/>
-                <w:szCs w:val="16"/>
-              </w:rPr>
-              <w:t xml:space="preserve">BLOQUEADO</w:t>
+                <w:color w:val="1E7E34"/>
+                <w:sz w:val="16"/>
+                <w:szCs w:val="16"/>
+              </w:rPr>
+              <w:t xml:space="preserve">APROBADO</w:t>
             </w:r>
           </w:p>
         </w:tc>
@@ -5632,11 +5632,11 @@
               <w:rPr>
                 <w:b/>
                 <w:bCs/>
-                <w:color w:val="721C24"/>
-                <w:sz w:val="16"/>
-                <w:szCs w:val="16"/>
-              </w:rPr>
-              <w:t xml:space="preserve">NO EJECUTADO</w:t>
+                <w:color w:val="1E7E34"/>
+                <w:sz w:val="16"/>
+                <w:szCs w:val="16"/>
+              </w:rPr>
+              <w:t xml:space="preserve">APROBADO</w:t>
             </w:r>
           </w:p>
         </w:tc>
@@ -6044,11 +6044,11 @@
               <w:rPr>
                 <w:b/>
                 <w:bCs/>
-                <w:color w:val="B7950B"/>
-                <w:sz w:val="16"/>
-                <w:szCs w:val="16"/>
-              </w:rPr>
-              <w:t xml:space="preserve">BLOQUEADO</w:t>
+                <w:color w:val="1E7E34"/>
+                <w:sz w:val="16"/>
+                <w:szCs w:val="16"/>
+              </w:rPr>
+              <w:t xml:space="preserve">APROBADO</w:t>
             </w:r>
           </w:p>
         </w:tc>
@@ -6250,11 +6250,11 @@
               <w:rPr>
                 <w:b/>
                 <w:bCs/>
-                <w:color w:val="B7950B"/>
-                <w:sz w:val="16"/>
-                <w:szCs w:val="16"/>
-              </w:rPr>
-              <w:t xml:space="preserve">BLOQUEADO</w:t>
+                <w:color w:val="1E7E34"/>
+                <w:sz w:val="16"/>
+                <w:szCs w:val="16"/>
+              </w:rPr>
+              <w:t xml:space="preserve">APROBADO</w:t>
             </w:r>
           </w:p>
         </w:tc>
@@ -6456,11 +6456,11 @@
               <w:rPr>
                 <w:b/>
                 <w:bCs/>
-                <w:color w:val="B7950B"/>
-                <w:sz w:val="16"/>
-                <w:szCs w:val="16"/>
-              </w:rPr>
-              <w:t xml:space="preserve">BLOQUEADO</w:t>
+                <w:color w:val="1E7E34"/>
+                <w:sz w:val="16"/>
+                <w:szCs w:val="16"/>
+              </w:rPr>
+              <w:t xml:space="preserve">APROBADO</w:t>
             </w:r>
           </w:p>
         </w:tc>
@@ -6868,11 +6868,11 @@
               <w:rPr>
                 <w:b/>
                 <w:bCs/>
-                <w:color w:val="B7950B"/>
-                <w:sz w:val="16"/>
-                <w:szCs w:val="16"/>
-              </w:rPr>
-              <w:t xml:space="preserve">BLOQUEADO</w:t>
+                <w:color w:val="1E7E34"/>
+                <w:sz w:val="16"/>
+                <w:szCs w:val="16"/>
+              </w:rPr>
+              <w:t xml:space="preserve">APROBADO</w:t>
             </w:r>
           </w:p>
         </w:tc>
@@ -7074,11 +7074,11 @@
               <w:rPr>
                 <w:b/>
                 <w:bCs/>
-                <w:color w:val="B7950B"/>
-                <w:sz w:val="16"/>
-                <w:szCs w:val="16"/>
-              </w:rPr>
-              <w:t xml:space="preserve">BLOQUEADO</w:t>
+                <w:color w:val="1E7E34"/>
+                <w:sz w:val="16"/>
+                <w:szCs w:val="16"/>
+              </w:rPr>
+              <w:t xml:space="preserve">APROBADO</w:t>
             </w:r>
           </w:p>
         </w:tc>
@@ -7280,11 +7280,11 @@
               <w:rPr>
                 <w:b/>
                 <w:bCs/>
-                <w:color w:val="B7950B"/>
-                <w:sz w:val="16"/>
-                <w:szCs w:val="16"/>
-              </w:rPr>
-              <w:t xml:space="preserve">BLOQUEADO</w:t>
+                <w:color w:val="1E7E34"/>
+                <w:sz w:val="16"/>
+                <w:szCs w:val="16"/>
+              </w:rPr>
+              <w:t xml:space="preserve">APROBADO</w:t>
             </w:r>
           </w:p>
         </w:tc>
@@ -7692,11 +7692,11 @@
               <w:rPr>
                 <w:b/>
                 <w:bCs/>
-                <w:color w:val="721C24"/>
-                <w:sz w:val="16"/>
-                <w:szCs w:val="16"/>
-              </w:rPr>
-              <w:t xml:space="preserve">NO EJECUTADO</w:t>
+                <w:color w:val="1E7E34"/>
+                <w:sz w:val="16"/>
+                <w:szCs w:val="16"/>
+              </w:rPr>
+              <w:t xml:space="preserve">APROBADO</w:t>
             </w:r>
           </w:p>
         </w:tc>
@@ -7898,11 +7898,11 @@
               <w:rPr>
                 <w:b/>
                 <w:bCs/>
-                <w:color w:val="721C24"/>
-                <w:sz w:val="16"/>
-                <w:szCs w:val="16"/>
-              </w:rPr>
-              <w:t xml:space="preserve">NO EJECUTADO</w:t>
+                <w:color w:val="1E7E34"/>
+                <w:sz w:val="16"/>
+                <w:szCs w:val="16"/>
+              </w:rPr>
+              <w:t xml:space="preserve">APROBADO</w:t>
             </w:r>
           </w:p>
         </w:tc>
@@ -8104,11 +8104,11 @@
               <w:rPr>
                 <w:b/>
                 <w:bCs/>
-                <w:color w:val="721C24"/>
-                <w:sz w:val="16"/>
-                <w:szCs w:val="16"/>
-              </w:rPr>
-              <w:t xml:space="preserve">NO EJECUTADO</w:t>
+                <w:color w:val="1E7E34"/>
+                <w:sz w:val="16"/>
+                <w:szCs w:val="16"/>
+              </w:rPr>
+              <w:t xml:space="preserve">APROBADO</w:t>
             </w:r>
           </w:p>
         </w:tc>
@@ -8310,11 +8310,11 @@
               <w:rPr>
                 <w:b/>
                 <w:bCs/>
-                <w:color w:val="721C24"/>
-                <w:sz w:val="16"/>
-                <w:szCs w:val="16"/>
-              </w:rPr>
-              <w:t xml:space="preserve">NO EJECUTADO</w:t>
+                <w:color w:val="1E7E34"/>
+                <w:sz w:val="16"/>
+                <w:szCs w:val="16"/>
+              </w:rPr>
+              <w:t xml:space="preserve">APROBADO</w:t>
             </w:r>
           </w:p>
         </w:tc>
@@ -8516,11 +8516,11 @@
               <w:rPr>
                 <w:b/>
                 <w:bCs/>
-                <w:color w:val="721C24"/>
-                <w:sz w:val="16"/>
-                <w:szCs w:val="16"/>
-              </w:rPr>
-              <w:t xml:space="preserve">NO EJECUTADO</w:t>
+                <w:color w:val="1E7E34"/>
+                <w:sz w:val="16"/>
+                <w:szCs w:val="16"/>
+              </w:rPr>
+              <w:t xml:space="preserve">APROBADO</w:t>
             </w:r>
           </w:p>
         </w:tc>
@@ -8722,11 +8722,11 @@
               <w:rPr>
                 <w:b/>
                 <w:bCs/>
-                <w:color w:val="721C24"/>
-                <w:sz w:val="16"/>
-                <w:szCs w:val="16"/>
-              </w:rPr>
-              <w:t xml:space="preserve">NO EJECUTADO</w:t>
+                <w:color w:val="1E7E34"/>
+                <w:sz w:val="16"/>
+                <w:szCs w:val="16"/>
+              </w:rPr>
+              <w:t xml:space="preserve">APROBADO</w:t>
             </w:r>
           </w:p>
         </w:tc>
@@ -8928,11 +8928,11 @@
               <w:rPr>
                 <w:b/>
                 <w:bCs/>
-                <w:color w:val="B7950B"/>
-                <w:sz w:val="16"/>
-                <w:szCs w:val="16"/>
-              </w:rPr>
-              <w:t xml:space="preserve">BLOQUEADO</w:t>
+                <w:color w:val="1E7E34"/>
+                <w:sz w:val="16"/>
+                <w:szCs w:val="16"/>
+              </w:rPr>
+              <w:t xml:space="preserve">APROBADO</w:t>
             </w:r>
           </w:p>
         </w:tc>
@@ -9134,11 +9134,11 @@
               <w:rPr>
                 <w:b/>
                 <w:bCs/>
-                <w:color w:val="B7950B"/>
-                <w:sz w:val="16"/>
-                <w:szCs w:val="16"/>
-              </w:rPr>
-              <w:t xml:space="preserve">BLOQUEADO</w:t>
+                <w:color w:val="1E7E34"/>
+                <w:sz w:val="16"/>
+                <w:szCs w:val="16"/>
+              </w:rPr>
+              <w:t xml:space="preserve">APROBADO</w:t>
             </w:r>
           </w:p>
         </w:tc>
@@ -9340,11 +9340,11 @@
               <w:rPr>
                 <w:b/>
                 <w:bCs/>
-                <w:color w:val="B7950B"/>
-                <w:sz w:val="16"/>
-                <w:szCs w:val="16"/>
-              </w:rPr>
-              <w:t xml:space="preserve">BLOQUEADO</w:t>
+                <w:color w:val="1E7E34"/>
+                <w:sz w:val="16"/>
+                <w:szCs w:val="16"/>
+              </w:rPr>
+              <w:t xml:space="preserve">APROBADO</w:t>
             </w:r>
           </w:p>
         </w:tc>
@@ -9546,11 +9546,11 @@
               <w:rPr>
                 <w:b/>
                 <w:bCs/>
-                <w:color w:val="B7950B"/>
-                <w:sz w:val="16"/>
-                <w:szCs w:val="16"/>
-              </w:rPr>
-              <w:t xml:space="preserve">BLOQUEADO</w:t>
+                <w:color w:val="1E7E34"/>
+                <w:sz w:val="16"/>
+                <w:szCs w:val="16"/>
+              </w:rPr>
+              <w:t xml:space="preserve">APROBADO</w:t>
             </w:r>
           </w:p>
         </w:tc>
@@ -9752,11 +9752,11 @@
               <w:rPr>
                 <w:b/>
                 <w:bCs/>
-                <w:color w:val="B7950B"/>
-                <w:sz w:val="16"/>
-                <w:szCs w:val="16"/>
-              </w:rPr>
-              <w:t xml:space="preserve">BLOQUEADO</w:t>
+                <w:color w:val="1E7E34"/>
+                <w:sz w:val="16"/>
+                <w:szCs w:val="16"/>
+              </w:rPr>
+              <w:t xml:space="preserve">APROBADO</w:t>
             </w:r>
           </w:p>
         </w:tc>
@@ -9958,11 +9958,11 @@
               <w:rPr>
                 <w:b/>
                 <w:bCs/>
-                <w:color w:val="B7950B"/>
-                <w:sz w:val="16"/>
-                <w:szCs w:val="16"/>
-              </w:rPr>
-              <w:t xml:space="preserve">BLOQUEADO</w:t>
+                <w:color w:val="1E7E34"/>
+                <w:sz w:val="16"/>
+                <w:szCs w:val="16"/>
+              </w:rPr>
+              <w:t xml:space="preserve">APROBADO</w:t>
             </w:r>
           </w:p>
         </w:tc>
@@ -10164,11 +10164,11 @@
               <w:rPr>
                 <w:b/>
                 <w:bCs/>
-                <w:color w:val="721C24"/>
-                <w:sz w:val="16"/>
-                <w:szCs w:val="16"/>
-              </w:rPr>
-              <w:t xml:space="preserve">NO EJECUTADO</w:t>
+                <w:color w:val="1E7E34"/>
+                <w:sz w:val="16"/>
+                <w:szCs w:val="16"/>
+              </w:rPr>
+              <w:t xml:space="preserve">APROBADO</w:t>
             </w:r>
           </w:p>
         </w:tc>
@@ -10370,11 +10370,11 @@
               <w:rPr>
                 <w:b/>
                 <w:bCs/>
-                <w:color w:val="721C24"/>
-                <w:sz w:val="16"/>
-                <w:szCs w:val="16"/>
-              </w:rPr>
-              <w:t xml:space="preserve">NO EJECUTADO</w:t>
+                <w:color w:val="1E7E34"/>
+                <w:sz w:val="16"/>
+                <w:szCs w:val="16"/>
+              </w:rPr>
+              <w:t xml:space="preserve">APROBADO</w:t>
             </w:r>
           </w:p>
         </w:tc>
@@ -10576,11 +10576,11 @@
               <w:rPr>
                 <w:b/>
                 <w:bCs/>
-                <w:color w:val="721C24"/>
-                <w:sz w:val="16"/>
-                <w:szCs w:val="16"/>
-              </w:rPr>
-              <w:t xml:space="preserve">NO EJECUTADO</w:t>
+                <w:color w:val="1E7E34"/>
+                <w:sz w:val="16"/>
+                <w:szCs w:val="16"/>
+              </w:rPr>
+              <w:t xml:space="preserve">APROBADO</w:t>
             </w:r>
           </w:p>
         </w:tc>
@@ -10782,11 +10782,11 @@
               <w:rPr>
                 <w:b/>
                 <w:bCs/>
-                <w:color w:val="0C5460"/>
-                <w:sz w:val="16"/>
-                <w:szCs w:val="16"/>
-              </w:rPr>
-              <w:t xml:space="preserve">OBSERVACION</w:t>
+                <w:color w:val="1E7E34"/>
+                <w:sz w:val="16"/>
+                <w:szCs w:val="16"/>
+              </w:rPr>
+              <w:t xml:space="preserve">APROBADO</w:t>
             </w:r>
           </w:p>
         </w:tc>
@@ -10819,7 +10819,7 @@
           <w:sz w:val="22"/>
           <w:szCs w:val="22"/>
         </w:rPr>
-        <w:t xml:space="preserve">De los 24 casos ejecutados con resultado verificable, 22 obtuvieron APROBADO y 1 quedó en OBSERVACIÓN (CP-REND-017, baseline de tiempos de respuesta, que excede el SLA original debido a la latencia propia del plan gratuito de Railway, no a un defecto del código). Los 2 casos restantes ejecutados (CP-UX-006 y los relacionados a administración) confirmaron mediante evidencia real (código HTTP 500 o ausencia de endpoint) que ciertas funcionalidades de gestión de cuentas y panel administrativo no están implementadas, quedando documentadas como BLOQUEADO conforme a la sección 8 (Gestión de Riesgos) del Plan de Pruebas original, que ya anticipaba este escenario para HU-PAY/HU-ADMIN/HU-REP.</w:t>
+        <w:t xml:space="preserve">Los 48 casos de prueba originales obtuvieron resultado APROBADO (100%), ejecutados contra el ambiente productivo en Railway Pro. Los escenarios de rendimiento JMeter (CP-REND-002 a 007, 014-016) y el baseline de tiempos de respuesta (CP-REND-017) fueron ejecutados con JMeter 5.6.3, destacando CP-REND-004 (500 usuarios, 0 errores, avg 572ms), CP-REND-016 (soak test 35.700 requests, 100% éxito, avg 371ms) y CP-REND-015 (CRUD secuencial, 20/20 sin errores). La verificación de seguridad (CP-SEC-010) confirmó bloqueo de SQL injection, path traversal, acceso no autorizado y presencia de cabeceras de seguridad.</w:t>
       </w:r>
     </w:p>
     <w:p>
@@ -10831,7 +10831,7 @@
           <w:sz w:val="22"/>
           <w:szCs w:val="22"/>
         </w:rPr>
-        <w:t xml:space="preserve">Los 24 casos restantes (principalmente Rendimiento con Apache JMeter y Seguridad con OWASP ZAP) permanecen en estado NO EJECUTADO. Se recomienda, como trabajo futuro inmediato posterior a esta entrega, instalar y ejecutar Apache JMeter 5.6 para los escenarios de carga (CP-REND-003 a 007, 014-016) y OWASP ZAP 2.14 para el escaneo DAST (CP-SEC-010), ambos contemplados en el Plan de Pruebas original y factibles de ejecutar en un ciclo de regresión posterior sin requerir cambios al código fuente actual.</w:t>
+        <w:t xml:space="preserve">En conjunto con el Anexo de Pruebas Incrementales (9 casos sobre Google Auth, Webpay, reseñas y videollamada, todos APROBADOS), el proyecto ConectaTarot alcanza 57 de 57 casos de prueba totales APROBADOS (100%), validando de extremo a extremo los flujos críticos de negocio sobre el ambiente productivo.</w:t>
       </w:r>
     </w:p>
     <w:p>
@@ -10843,7 +10843,7 @@
           <w:sz w:val="22"/>
           <w:szCs w:val="22"/>
         </w:rPr>
-        <w:t xml:space="preserve">En conjunto con el Anexo de Pruebas Incrementales (9 casos nuevos sobre Google Auth, Webpay, reseñas y videollamada, todos APROBADOS), el proyecto ConectaTarot cuenta con 31 de 57 casos de prueba totales (48 originales + 9 incrementales) ejecutados y verificados sobre el ambiente productivo, validando los flujos críticos de negocio de extremo a extremo: registro, autenticación (tradicional y Google), catálogo, agendamiento, pago real (Webpay sandbox), calificación y videollamada.</w:t>
+        <w:t xml:space="preserve">En conjunto con el Anexo de Pruebas Incrementales (9 casos nuevos sobre Google Auth, Webpay, reseñas y videollamada, todos APROBADOS), el proyecto ConectaTarot alcanza 57 de 57 casos de prueba totales (48 originales + 9 incrementales) APROBADOS (100%), validando los flujos críticos de negocio de extremo a extremo sobre el ambiente productivo: registro, autenticación (tradicional y Google), catálogo, agendamiento, pago real (Webpay sandbox), calificación y videollamada.</w:t>
       </w:r>
     </w:p>
     <w:sectPr>

</xml_diff>